<commit_message>
Add Situated Reality Lab research from September 2026 and one-page CV
</commit_message>
<xml_diff>
--- a/assets/ziming-gao-cv.docx
+++ b/assets/ziming-gao-cv.docx
@@ -4,7 +4,7 @@
   <w:body>
     <w:p>
       <w:pPr>
-        <w:spacing w:after="40" w:line="380" w:lineRule="exact"/>
+        <w:spacing w:after="40" w:line="230" w:lineRule="exact" w:before="0"/>
         <w:jc w:val="center"/>
         <w:rPr>
           <w:rFonts w:ascii="Times New Roman" w:hAnsi="Times New Roman" w:cs="Times New Roman"/>
@@ -12,6 +12,7 @@
           <w:sz w:val="36"/>
           <w:szCs w:val="36"/>
         </w:rPr>
+        <w:snapToGrid w:val="0"/>
       </w:pPr>
       <w:r>
         <w:rPr>
@@ -25,12 +26,13 @@
     </w:p>
     <w:p>
       <w:pPr>
-        <w:spacing w:after="100" w:line="270" w:lineRule="exact"/>
+        <w:spacing w:after="40" w:line="230" w:lineRule="exact" w:before="0"/>
         <w:jc w:val="center"/>
         <w:rPr>
           <w:rFonts w:ascii="Times New Roman" w:hAnsi="Times New Roman" w:cs="Times New Roman"/>
           <w:szCs w:val="21"/>
         </w:rPr>
+        <w:snapToGrid w:val="0"/>
       </w:pPr>
       <w:r>
         <w:rPr>
@@ -82,12 +84,25 @@
         <w:t>.</w:t>
       </w:r>
       <w:r>
+        <w:t>hku.hk</w:t>
+      </w:r>
+      <w:r>
         <w:rPr>
           <w:rFonts w:ascii="Times New Roman" w:hAnsi="Times New Roman" w:cs="Times New Roman" w:hint="eastAsia"/>
           <w:szCs w:val="21"/>
         </w:rPr>
-        <w:t>hku.hk</w:t>
-      </w:r>
+        <w:t xml:space="preserve"> / </w:t>
+      </w:r>
+      <w:hyperlink r:id="rId7">
+        <w:r>
+          <w:rPr>
+            <w:rFonts w:ascii="Times New Roman" w:hAnsi="Times New Roman"/>
+            <w:sz w:val="19"/>
+            <w:u w:val="single"/>
+          </w:rPr>
+          <w:t>ziminggao-o.github.io</w:t>
+        </w:r>
+      </w:hyperlink>
     </w:p>
     <w:p>
       <w:pPr>
@@ -96,7 +111,7 @@
         <w:pBdr>
           <w:bottom w:val="single" w:sz="6" w:space="1" w:color="000000"/>
         </w:pBdr>
-        <w:spacing w:after="28" w:line="280" w:lineRule="exact"/>
+        <w:spacing w:after="60" w:line="230" w:lineRule="exact" w:before="120"/>
         <w:jc w:val="left"/>
         <w:rPr>
           <w:rFonts w:ascii="Times New Roman" w:hAnsi="Times New Roman" w:cs="Times New Roman"/>
@@ -104,12 +119,13 @@
           <w:sz w:val="23"/>
           <w:szCs w:val="23"/>
         </w:rPr>
+        <w:snapToGrid w:val="0"/>
       </w:pPr>
       <w:r>
         <w:rPr>
           <w:rFonts w:ascii="Times New Roman" w:hAnsi="Times New Roman" w:cs="Times New Roman"/>
           <w:b/>
-          <w:sz w:val="23"/>
+          <w:sz w:val="20"/>
           <w:szCs w:val="23"/>
         </w:rPr>
         <w:t>Research Interests</w:t>
@@ -118,20 +134,21 @@
     <w:p>
       <w:pPr>
         <w:keepLines/>
-        <w:spacing w:after="20" w:line="260" w:lineRule="exact"/>
+        <w:spacing w:after="40" w:line="230" w:lineRule="exact" w:before="0"/>
         <w:jc w:val="left"/>
         <w:rPr>
           <w:rFonts w:ascii="Times New Roman" w:hAnsi="Times New Roman" w:cs="Times New Roman"/>
           <w:b/>
           <w:szCs w:val="21"/>
         </w:rPr>
-      </w:pPr>
-      <w:r>
-        <w:rPr>
-          <w:rFonts w:ascii="Times New Roman" w:hAnsi="Times New Roman" w:cs="Times New Roman"/>
-          <w:szCs w:val="21"/>
-        </w:rPr>
-        <w:t>Human-computer interaction; human-AI interaction; context-aware assistance for physical activities; physical skill learning; wearable and multimodal interaction.</w:t>
+        <w:snapToGrid w:val="0"/>
+      </w:pPr>
+      <w:r>
+        <w:rPr>
+          <w:rFonts w:ascii="Times New Roman" w:hAnsi="Times New Roman" w:cs="Times New Roman"/>
+          <w:szCs w:val="21"/>
+        </w:rPr>
+        <w:t>Human-computer interaction; XR interaction; human-AI interaction; context-aware assistance for physical activities.</w:t>
       </w:r>
     </w:p>
     <w:p>
@@ -141,7 +158,7 @@
         <w:pBdr>
           <w:bottom w:val="single" w:sz="6" w:space="1" w:color="000000"/>
         </w:pBdr>
-        <w:spacing w:before="80" w:after="28" w:line="280" w:lineRule="exact"/>
+        <w:spacing w:before="120" w:after="60" w:line="230" w:lineRule="exact"/>
         <w:jc w:val="left"/>
         <w:rPr>
           <w:rFonts w:ascii="Times New Roman" w:hAnsi="Times New Roman" w:cs="Times New Roman"/>
@@ -149,12 +166,13 @@
           <w:sz w:val="23"/>
           <w:szCs w:val="23"/>
         </w:rPr>
+        <w:snapToGrid w:val="0"/>
       </w:pPr>
       <w:r>
         <w:rPr>
           <w:rFonts w:ascii="Times New Roman" w:hAnsi="Times New Roman" w:cs="Times New Roman"/>
           <w:b/>
-          <w:sz w:val="23"/>
+          <w:sz w:val="20"/>
           <w:szCs w:val="23"/>
         </w:rPr>
         <w:t>Educational Background</w:t>
@@ -166,13 +184,14 @@
         <w:tabs>
           <w:tab w:val="right" w:pos="9026"/>
         </w:tabs>
-        <w:spacing w:line="256" w:lineRule="exact"/>
+        <w:spacing w:line="230" w:lineRule="exact" w:after="40" w:before="0"/>
         <w:jc w:val="left"/>
         <w:rPr>
           <w:rFonts w:ascii="Times New Roman" w:hAnsi="Times New Roman" w:cs="Times New Roman"/>
           <w:b/>
           <w:szCs w:val="21"/>
         </w:rPr>
+        <w:snapToGrid w:val="0"/>
       </w:pPr>
       <w:r>
         <w:rPr>
@@ -194,13 +213,14 @@
     <w:p>
       <w:pPr>
         <w:keepNext/>
-        <w:spacing w:line="256" w:lineRule="exact"/>
+        <w:spacing w:line="230" w:lineRule="exact" w:after="40" w:before="0"/>
         <w:jc w:val="left"/>
         <w:rPr>
           <w:rFonts w:ascii="Times New Roman" w:hAnsi="Times New Roman" w:cs="Times New Roman"/>
           <w:i/>
           <w:szCs w:val="21"/>
         </w:rPr>
+        <w:snapToGrid w:val="0"/>
       </w:pPr>
       <w:r>
         <w:rPr>
@@ -217,13 +237,14 @@
         <w:tabs>
           <w:tab w:val="right" w:pos="9026"/>
         </w:tabs>
-        <w:spacing w:line="256" w:lineRule="exact"/>
+        <w:spacing w:line="230" w:lineRule="exact" w:after="40" w:before="0"/>
         <w:jc w:val="left"/>
         <w:rPr>
           <w:rFonts w:ascii="Times New Roman" w:hAnsi="Times New Roman" w:cs="Times New Roman"/>
           <w:b/>
           <w:szCs w:val="21"/>
         </w:rPr>
+        <w:snapToGrid w:val="0"/>
       </w:pPr>
       <w:r>
         <w:rPr>
@@ -245,13 +266,14 @@
     <w:p>
       <w:pPr>
         <w:keepNext/>
-        <w:spacing w:line="256" w:lineRule="exact"/>
+        <w:spacing w:line="230" w:lineRule="exact" w:after="40" w:before="0"/>
         <w:jc w:val="left"/>
         <w:rPr>
           <w:rFonts w:ascii="Times New Roman" w:hAnsi="Times New Roman" w:cs="Times New Roman"/>
           <w:i/>
           <w:szCs w:val="21"/>
         </w:rPr>
+        <w:snapToGrid w:val="0"/>
       </w:pPr>
       <w:r>
         <w:rPr>
@@ -267,13 +289,14 @@
         <w:tabs>
           <w:tab w:val="left" w:pos="210"/>
         </w:tabs>
-        <w:spacing w:line="256" w:lineRule="exact"/>
+        <w:spacing w:line="230" w:lineRule="exact" w:after="40" w:before="0"/>
         <w:ind w:left="210" w:hanging="210"/>
         <w:jc w:val="left"/>
         <w:rPr>
           <w:rFonts w:ascii="Times New Roman" w:hAnsi="Times New Roman" w:cs="Times New Roman"/>
           <w:szCs w:val="21"/>
         </w:rPr>
+        <w:snapToGrid w:val="0"/>
       </w:pPr>
       <w:r>
         <w:rPr>
@@ -296,13 +319,14 @@
         <w:tabs>
           <w:tab w:val="left" w:pos="210"/>
         </w:tabs>
-        <w:spacing w:line="256" w:lineRule="exact"/>
+        <w:spacing w:line="230" w:lineRule="exact" w:after="40" w:before="0"/>
         <w:ind w:left="210" w:hanging="210"/>
         <w:jc w:val="left"/>
         <w:rPr>
           <w:rFonts w:ascii="Times New Roman" w:hAnsi="Times New Roman" w:cs="Times New Roman"/>
           <w:szCs w:val="21"/>
         </w:rPr>
+        <w:snapToGrid w:val="0"/>
       </w:pPr>
       <w:r>
         <w:rPr>
@@ -310,20 +334,20 @@
           <w:szCs w:val="21"/>
         </w:rPr>
         <w:t>•</w:t>
-      </w:r>
-      <w:r>
-        <w:rPr>
-          <w:rFonts w:ascii="Times New Roman" w:hAnsi="Times New Roman" w:cs="Times New Roman"/>
-          <w:szCs w:val="21"/>
-        </w:rPr>
         <w:tab/>
-      </w:r>
-      <w:r>
-        <w:rPr>
-          <w:rFonts w:ascii="Times New Roman" w:hAnsi="Times New Roman" w:cs="Times New Roman"/>
-          <w:szCs w:val="21"/>
-        </w:rPr>
-        <w:t>BUAA Scholarships: Top Prize of Encouragement Scholarship (top 5%) &amp; Second Prize of Merit Scholarship (2023/24); Second Prize of Encouragement Scholarship (2022/23)</w:t>
+        <w:t>BUAA scholarships: Encouragement (top prize, top 5%, 2023/24; second prize, 2022/23); Merit (second prize, 2023/24).</w:t>
+      </w:r>
+      <w:r>
+        <w:rPr>
+          <w:rFonts w:ascii="Times New Roman" w:hAnsi="Times New Roman" w:cs="Times New Roman"/>
+          <w:szCs w:val="21"/>
+        </w:rPr>
+      </w:r>
+      <w:r>
+        <w:rPr>
+          <w:rFonts w:ascii="Times New Roman" w:hAnsi="Times New Roman" w:cs="Times New Roman"/>
+          <w:szCs w:val="21"/>
+        </w:rPr>
       </w:r>
     </w:p>
     <w:p>
@@ -332,7 +356,7 @@
         <w:pBdr>
           <w:bottom w:val="single" w:sz="6" w:space="1" w:color="auto"/>
         </w:pBdr>
-        <w:spacing w:beforeLines="40" w:before="124" w:line="256" w:lineRule="exact"/>
+        <w:spacing w:beforeLines="40" w:before="120" w:line="230" w:lineRule="exact" w:after="60"/>
         <w:jc w:val="left"/>
         <w:rPr>
           <w:rFonts w:ascii="Times New Roman" w:hAnsi="Times New Roman" w:cs="Times New Roman"/>
@@ -340,12 +364,13 @@
           <w:sz w:val="23"/>
           <w:szCs w:val="23"/>
         </w:rPr>
+        <w:snapToGrid w:val="0"/>
       </w:pPr>
       <w:r>
         <w:rPr>
           <w:rFonts w:ascii="Times New Roman" w:hAnsi="Times New Roman" w:cs="Times New Roman"/>
           <w:b/>
-          <w:sz w:val="23"/>
+          <w:sz w:val="20"/>
           <w:szCs w:val="23"/>
         </w:rPr>
         <w:t>Research Experience</w:t>
@@ -357,13 +382,14 @@
         <w:tabs>
           <w:tab w:val="right" w:pos="9026"/>
         </w:tabs>
-        <w:spacing w:line="256" w:lineRule="exact"/>
+        <w:spacing w:line="230" w:lineRule="exact" w:after="40" w:before="0"/>
         <w:jc w:val="left"/>
         <w:rPr>
           <w:rFonts w:ascii="Times New Roman" w:hAnsi="Times New Roman" w:cs="Times New Roman"/>
           <w:b/>
           <w:szCs w:val="21"/>
         </w:rPr>
+        <w:snapToGrid w:val="0"/>
       </w:pPr>
       <w:r>
         <w:rPr>
@@ -371,34 +397,34 @@
           <w:b/>
           <w:szCs w:val="21"/>
         </w:rPr>
-        <w:t>IDEA Lab, Zhejiang University</w:t>
-      </w:r>
-      <w:r>
-        <w:rPr>
-          <w:rFonts w:ascii="Times New Roman" w:hAnsi="Times New Roman" w:cs="Times New Roman"/>
-          <w:szCs w:val="21"/>
-        </w:rPr>
+        <w:t>Situated Reality Lab, The University of Hong Kong</w:t>
         <w:tab/>
-        <w:t>03/2026</w:t>
+        <w:t>09/2026–present</w:t>
+      </w:r>
+      <w:r>
+        <w:rPr>
+          <w:rFonts w:ascii="Times New Roman" w:hAnsi="Times New Roman" w:cs="Times New Roman"/>
+          <w:szCs w:val="21"/>
+        </w:rPr>
       </w:r>
       <w:r>
         <w:rPr>
           <w:rFonts w:ascii="Times New Roman" w:hAnsi="Times New Roman" w:cs="Times New Roman" w:hint="eastAsia"/>
           <w:szCs w:val="21"/>
         </w:rPr>
-        <w:t>-present</w:t>
       </w:r>
     </w:p>
     <w:p>
       <w:pPr>
         <w:keepNext/>
-        <w:spacing w:line="256" w:lineRule="exact"/>
+        <w:spacing w:line="230" w:lineRule="exact" w:after="40" w:before="0"/>
         <w:jc w:val="left"/>
         <w:rPr>
           <w:rFonts w:ascii="Times New Roman" w:hAnsi="Times New Roman" w:cs="Times New Roman"/>
           <w:i/>
           <w:szCs w:val="21"/>
         </w:rPr>
+        <w:snapToGrid w:val="0"/>
       </w:pPr>
       <w:r>
         <w:rPr>
@@ -406,25 +432,61 @@
           <w:i/>
           <w:szCs w:val="21"/>
         </w:rPr>
-        <w:t>Research Intern; research mentors: Lingyun Sun and Hongbo Zhang</w:t>
-      </w:r>
-    </w:p>
-    <w:p>
-      <w:pPr>
-        <w:spacing w:line="256" w:lineRule="exact"/>
-        <w:jc w:val="left"/>
+        <w:t>MSc Dissertation Research · Supervisor: Prof. Xiang Li</w:t>
+      </w:r>
+      <w:r>
+        <w:rPr>
+          <w:rFonts w:ascii="Times New Roman" w:hAnsi="Times New Roman" w:cs="Times New Roman" w:hint="eastAsia"/>
+          <w:i/>
+          <w:szCs w:val="21"/>
+        </w:rPr>
+      </w:r>
+      <w:r>
+        <w:rPr>
+          <w:rFonts w:ascii="Times New Roman" w:hAnsi="Times New Roman" w:cs="Times New Roman"/>
+          <w:szCs w:val="21"/>
+        </w:rPr>
+      </w:r>
+    </w:p>
+    <w:p>
+      <w:pPr>
+        <w:keepNext/>
+        <w:spacing w:line="230" w:lineRule="exact" w:after="40" w:before="0"/>
+        <w:jc w:val="left"/>
+        <w:rPr>
+          <w:rFonts w:ascii="Times New Roman" w:hAnsi="Times New Roman" w:cs="Times New Roman"/>
+          <w:szCs w:val="21"/>
+        </w:rPr>
+        <w:snapToGrid w:val="0"/>
+      </w:pPr>
+      <w:r>
         <w:rPr>
           <w:rFonts w:ascii="Times New Roman" w:hAnsi="Times New Roman" w:cs="Times New Roman"/>
           <w:b/>
           <w:szCs w:val="21"/>
         </w:rPr>
-      </w:pPr>
-      <w:r>
-        <w:rPr>
-          <w:rFonts w:ascii="Times New Roman" w:hAnsi="Times New Roman" w:cs="Times New Roman"/>
-          <w:szCs w:val="21"/>
-        </w:rPr>
-        <w:t>Focus: Human-AI interaction and context-aware assistance for physical activities.</w:t>
+        <w:t>XR Microgestures during Bimanual Object Handling</w:t>
+      </w:r>
+    </w:p>
+    <w:p>
+      <w:pPr>
+        <w:keepNext/>
+        <w:spacing w:line="230" w:lineRule="exact" w:after="40" w:before="0"/>
+        <w:jc w:val="left"/>
+        <w:rPr>
+          <w:rFonts w:ascii="Times New Roman" w:hAnsi="Times New Roman" w:cs="Times New Roman"/>
+          <w:i/>
+          <w:szCs w:val="21"/>
+        </w:rPr>
+        <w:snapToGrid w:val="0"/>
+      </w:pPr>
+      <w:r>
+        <w:rPr>
+          <w:rFonts w:ascii="Times New Roman" w:hAnsi="Times New Roman" w:cs="Times New Roman"/>
+          <w:i/>
+          <w:szCs w:val="21"/>
+        </w:rPr>
+        <w:t>Early-stage research; target venue: UIST 2027.</w:t>
       </w:r>
     </w:p>
     <w:p>
@@ -432,13 +494,14 @@
         <w:tabs>
           <w:tab w:val="left" w:pos="210"/>
         </w:tabs>
-        <w:spacing w:line="256" w:lineRule="exact"/>
+        <w:spacing w:line="230" w:lineRule="exact" w:after="40" w:before="0"/>
         <w:ind w:left="210" w:hanging="210"/>
         <w:jc w:val="left"/>
         <w:rPr>
           <w:rFonts w:ascii="Times New Roman" w:hAnsi="Times New Roman" w:cs="Times New Roman"/>
           <w:szCs w:val="21"/>
         </w:rPr>
+        <w:snapToGrid w:val="0"/>
       </w:pPr>
       <w:r>
         <w:rPr>
@@ -446,53 +509,14 @@
           <w:szCs w:val="21"/>
         </w:rPr>
         <w:t>•</w:t>
-      </w:r>
-      <w:r>
-        <w:rPr>
-          <w:rFonts w:ascii="Times New Roman" w:hAnsi="Times New Roman" w:cs="Times New Roman"/>
-          <w:szCs w:val="21"/>
-        </w:rPr>
         <w:tab/>
-        <w:t>Presented the group’s research on contextual AI assistance at the IDEA Lab Summer Meeting, Zhejiang University, on 31 July 2026.</w:t>
-      </w:r>
-    </w:p>
-    <w:p>
-      <w:pPr>
-        <w:keepNext/>
-        <w:spacing w:line="256" w:lineRule="exact"/>
-        <w:jc w:val="left"/>
-        <w:rPr>
-          <w:rFonts w:ascii="Times New Roman" w:hAnsi="Times New Roman" w:cs="Times New Roman"/>
-          <w:szCs w:val="21"/>
-        </w:rPr>
-      </w:pPr>
-      <w:r>
-        <w:rPr>
-          <w:rFonts w:ascii="Times New Roman" w:hAnsi="Times New Roman" w:cs="Times New Roman"/>
-          <w:b/>
-          <w:szCs w:val="21"/>
-        </w:rPr>
-        <w:t>Physical-Knowledge Grounding</w:t>
-      </w:r>
-    </w:p>
-    <w:p>
-      <w:pPr>
-        <w:keepNext/>
-        <w:spacing w:line="256" w:lineRule="exact"/>
-        <w:jc w:val="left"/>
-        <w:rPr>
-          <w:rFonts w:ascii="Times New Roman" w:hAnsi="Times New Roman" w:cs="Times New Roman"/>
-          <w:i/>
-          <w:szCs w:val="21"/>
-        </w:rPr>
-      </w:pPr>
-      <w:r>
-        <w:rPr>
-          <w:rFonts w:ascii="Times New Roman" w:hAnsi="Times New Roman" w:cs="Times New Roman"/>
-          <w:i/>
-          <w:szCs w:val="21"/>
-        </w:rPr>
-        <w:t>Ongoing research; preparing a manuscript for CHI submission.</w:t>
+        <w:t>Investigating small command gestures while both hands hold or manipulate an object, with minimal disruption to the primary task.</w:t>
+      </w:r>
+      <w:r>
+        <w:rPr>
+          <w:rFonts w:ascii="Times New Roman" w:hAnsi="Times New Roman" w:cs="Times New Roman"/>
+          <w:szCs w:val="21"/>
+        </w:rPr>
       </w:r>
     </w:p>
     <w:p>
@@ -500,13 +524,14 @@
         <w:tabs>
           <w:tab w:val="left" w:pos="210"/>
         </w:tabs>
-        <w:spacing w:line="256" w:lineRule="exact"/>
+        <w:spacing w:line="230" w:lineRule="exact" w:after="40" w:before="0"/>
         <w:ind w:left="210" w:hanging="210"/>
         <w:jc w:val="left"/>
         <w:rPr>
           <w:rFonts w:ascii="Times New Roman" w:hAnsi="Times New Roman" w:cs="Times New Roman"/>
           <w:szCs w:val="21"/>
         </w:rPr>
+        <w:snapToGrid w:val="0"/>
       </w:pPr>
       <w:r>
         <w:rPr>
@@ -514,140 +539,14 @@
           <w:szCs w:val="21"/>
         </w:rPr>
         <w:t>•</w:t>
-      </w:r>
-      <w:r>
-        <w:rPr>
-          <w:rFonts w:ascii="Times New Roman" w:hAnsi="Times New Roman" w:cs="Times New Roman"/>
-          <w:szCs w:val="21"/>
-        </w:rPr>
         <w:tab/>
-        <w:t>Responsible for the formative study on adapting online physical-skill tutorials to users’ materials, tools, and environments through questionnaire and interview research.</w:t>
-      </w:r>
-    </w:p>
-    <w:p>
-      <w:pPr>
-        <w:tabs>
-          <w:tab w:val="left" w:pos="210"/>
-        </w:tabs>
-        <w:spacing w:line="256" w:lineRule="exact"/>
-        <w:ind w:left="210" w:hanging="210"/>
-        <w:jc w:val="left"/>
-        <w:rPr>
-          <w:rFonts w:ascii="Times New Roman" w:hAnsi="Times New Roman" w:cs="Times New Roman"/>
-          <w:szCs w:val="21"/>
-        </w:rPr>
-      </w:pPr>
-      <w:r>
-        <w:rPr>
-          <w:rFonts w:ascii="Times New Roman" w:hAnsi="Times New Roman" w:cs="Times New Roman"/>
-          <w:szCs w:val="21"/>
-        </w:rPr>
-        <w:t>•</w:t>
-      </w:r>
-      <w:r>
-        <w:rPr>
-          <w:rFonts w:ascii="Times New Roman" w:hAnsi="Times New Roman" w:cs="Times New Roman"/>
-          <w:szCs w:val="21"/>
-        </w:rPr>
-        <w:tab/>
-        <w:t>Synthesized findings into research challenges and design goals; created research figures and supported experimental activities.</w:t>
-      </w:r>
-    </w:p>
-    <w:p>
-      <w:pPr>
-        <w:keepNext/>
-        <w:spacing w:line="256" w:lineRule="exact"/>
-        <w:jc w:val="left"/>
-        <w:rPr>
-          <w:rFonts w:ascii="Times New Roman" w:hAnsi="Times New Roman" w:cs="Times New Roman"/>
-          <w:szCs w:val="21"/>
-        </w:rPr>
-      </w:pPr>
-      <w:r>
-        <w:rPr>
-          <w:rFonts w:ascii="Times New Roman" w:hAnsi="Times New Roman" w:cs="Times New Roman"/>
-          <w:b/>
-          <w:szCs w:val="21"/>
-        </w:rPr>
-        <w:t>Situation-Bound Intent</w:t>
-      </w:r>
-    </w:p>
-    <w:p>
-      <w:pPr>
-        <w:keepNext/>
-        <w:spacing w:line="256" w:lineRule="exact"/>
-        <w:jc w:val="left"/>
-        <w:rPr>
-          <w:rFonts w:ascii="Times New Roman" w:hAnsi="Times New Roman" w:cs="Times New Roman"/>
-          <w:i/>
-          <w:szCs w:val="21"/>
-        </w:rPr>
-      </w:pPr>
-      <w:r>
-        <w:rPr>
-          <w:rFonts w:ascii="Times New Roman" w:hAnsi="Times New Roman" w:cs="Times New Roman"/>
-          <w:i/>
-          <w:szCs w:val="21"/>
-        </w:rPr>
-        <w:t>Manuscript submitted to ACM TOCHI; fourth author.</w:t>
-      </w:r>
-    </w:p>
-    <w:p>
-      <w:pPr>
-        <w:tabs>
-          <w:tab w:val="left" w:pos="210"/>
-        </w:tabs>
-        <w:spacing w:line="256" w:lineRule="exact"/>
-        <w:ind w:left="210" w:hanging="210"/>
-        <w:jc w:val="left"/>
-        <w:rPr>
-          <w:rFonts w:ascii="Times New Roman" w:hAnsi="Times New Roman" w:cs="Times New Roman"/>
-          <w:szCs w:val="21"/>
-        </w:rPr>
-      </w:pPr>
-      <w:r>
-        <w:rPr>
-          <w:rFonts w:ascii="Times New Roman" w:hAnsi="Times New Roman" w:cs="Times New Roman"/>
-          <w:szCs w:val="21"/>
-        </w:rPr>
-        <w:t>•</w:t>
-      </w:r>
-      <w:r>
-        <w:rPr>
-          <w:rFonts w:ascii="Times New Roman" w:hAnsi="Times New Roman" w:cs="Times New Roman"/>
-          <w:szCs w:val="21"/>
-        </w:rPr>
-        <w:tab/>
-        <w:t>Designed modular wearable hardware for the application-space component of a system for situation-aware prospective memory assistance.</w:t>
-      </w:r>
-    </w:p>
-    <w:p>
-      <w:pPr>
-        <w:tabs>
-          <w:tab w:val="left" w:pos="210"/>
-        </w:tabs>
-        <w:spacing w:line="256" w:lineRule="exact"/>
-        <w:ind w:left="210" w:hanging="210"/>
-        <w:jc w:val="left"/>
-        <w:rPr>
-          <w:rFonts w:ascii="Times New Roman" w:hAnsi="Times New Roman" w:cs="Times New Roman"/>
-          <w:szCs w:val="21"/>
-        </w:rPr>
-      </w:pPr>
-      <w:r>
-        <w:rPr>
-          <w:rFonts w:ascii="Times New Roman" w:hAnsi="Times New Roman" w:cs="Times New Roman"/>
-          <w:szCs w:val="21"/>
-        </w:rPr>
-        <w:t>•</w:t>
-      </w:r>
-      <w:r>
-        <w:rPr>
-          <w:rFonts w:ascii="Times New Roman" w:hAnsi="Times New Roman" w:cs="Times New Roman"/>
-          <w:szCs w:val="21"/>
-        </w:rPr>
-        <w:tab/>
-        <w:t>Created user-study result figures and refined other manuscript visuals.</w:t>
+        <w:t>Planning gesture elicitation and recognition studies; comparing rigid-panel and fabric inspection scenarios and evaluating task stability.</w:t>
+      </w:r>
+      <w:r>
+        <w:rPr>
+          <w:rFonts w:ascii="Times New Roman" w:hAnsi="Times New Roman" w:cs="Times New Roman"/>
+          <w:szCs w:val="21"/>
+        </w:rPr>
       </w:r>
     </w:p>
     <w:p>
@@ -656,13 +555,14 @@
         <w:tabs>
           <w:tab w:val="right" w:pos="9026"/>
         </w:tabs>
-        <w:spacing w:line="256" w:lineRule="exact"/>
+        <w:spacing w:line="230" w:lineRule="exact" w:after="40" w:before="0"/>
         <w:jc w:val="left"/>
         <w:rPr>
           <w:rFonts w:ascii="Times New Roman" w:hAnsi="Times New Roman" w:cs="Times New Roman"/>
           <w:b/>
           <w:szCs w:val="21"/>
         </w:rPr>
+        <w:snapToGrid w:val="0"/>
       </w:pPr>
       <w:r>
         <w:rPr>
@@ -670,7 +570,7 @@
           <w:b/>
           <w:szCs w:val="21"/>
         </w:rPr>
-        <w:t>School of Mechanical Engineering &amp; Automation, BUAA</w:t>
+        <w:t>IDEA Lab, Zhejiang University</w:t>
       </w:r>
       <w:r>
         <w:rPr>
@@ -678,19 +578,27 @@
           <w:szCs w:val="21"/>
         </w:rPr>
         <w:tab/>
-        <w:t>09/2025-03/2026</w:t>
+        <w:t>03/2026</w:t>
+      </w:r>
+      <w:r>
+        <w:rPr>
+          <w:rFonts w:ascii="Times New Roman" w:hAnsi="Times New Roman" w:cs="Times New Roman" w:hint="eastAsia"/>
+          <w:szCs w:val="21"/>
+        </w:rPr>
+        <w:t>-present</w:t>
       </w:r>
     </w:p>
     <w:p>
       <w:pPr>
         <w:keepNext/>
-        <w:spacing w:line="256" w:lineRule="exact"/>
+        <w:spacing w:line="230" w:lineRule="exact" w:after="40" w:before="0"/>
         <w:jc w:val="left"/>
         <w:rPr>
           <w:rFonts w:ascii="Times New Roman" w:hAnsi="Times New Roman" w:cs="Times New Roman"/>
           <w:i/>
           <w:szCs w:val="21"/>
         </w:rPr>
+        <w:snapToGrid w:val="0"/>
       </w:pPr>
       <w:r>
         <w:rPr>
@@ -698,7 +606,63 @@
           <w:i/>
           <w:szCs w:val="21"/>
         </w:rPr>
-        <w:t>Part-time Research Assistant, High-temperature and High-pressure Flexible Forming Laboratory</w:t>
+        <w:t>Research Intern</w:t>
+      </w:r>
+      <w:r>
+        <w:rPr>
+          <w:rFonts w:ascii="Times New Roman" w:hAnsi="Times New Roman" w:cs="Times New Roman" w:hint="eastAsia"/>
+          <w:i/>
+          <w:szCs w:val="21"/>
+        </w:rPr>
+        <w:t xml:space="preserve">; </w:t>
+      </w:r>
+      <w:r>
+        <w:rPr>
+          <w:rFonts w:ascii="Times New Roman" w:hAnsi="Times New Roman" w:cs="Times New Roman"/>
+          <w:szCs w:val="21"/>
+        </w:rPr>
+        <w:t>Focus: Human-AI interaction and context-aware assistance for physical activities.</w:t>
+      </w:r>
+    </w:p>
+    <w:p>
+      <w:pPr>
+        <w:keepNext/>
+        <w:spacing w:line="230" w:lineRule="exact" w:after="40" w:before="0"/>
+        <w:jc w:val="left"/>
+        <w:rPr>
+          <w:rFonts w:ascii="Times New Roman" w:hAnsi="Times New Roman" w:cs="Times New Roman"/>
+          <w:szCs w:val="21"/>
+        </w:rPr>
+        <w:snapToGrid w:val="0"/>
+      </w:pPr>
+      <w:r>
+        <w:rPr>
+          <w:rFonts w:ascii="Times New Roman" w:hAnsi="Times New Roman" w:cs="Times New Roman"/>
+          <w:b/>
+          <w:szCs w:val="21"/>
+        </w:rPr>
+        <w:t>Physical-Knowledge Grounding</w:t>
+      </w:r>
+    </w:p>
+    <w:p>
+      <w:pPr>
+        <w:keepNext/>
+        <w:spacing w:line="230" w:lineRule="exact" w:after="40" w:before="0"/>
+        <w:jc w:val="left"/>
+        <w:rPr>
+          <w:rFonts w:ascii="Times New Roman" w:hAnsi="Times New Roman" w:cs="Times New Roman"/>
+          <w:i/>
+          <w:szCs w:val="21"/>
+        </w:rPr>
+        <w:snapToGrid w:val="0"/>
+      </w:pPr>
+      <w:r>
+        <w:rPr>
+          <w:rFonts w:ascii="Times New Roman" w:hAnsi="Times New Roman" w:cs="Times New Roman"/>
+          <w:i/>
+          <w:szCs w:val="21"/>
+        </w:rPr>
+        <w:t>Ongoing research; preparing a manuscript for CHI submission.</w:t>
       </w:r>
     </w:p>
     <w:p>
@@ -706,13 +670,228 @@
         <w:tabs>
           <w:tab w:val="left" w:pos="210"/>
         </w:tabs>
-        <w:spacing w:line="256" w:lineRule="exact"/>
+        <w:spacing w:line="230" w:lineRule="exact" w:after="40" w:before="0"/>
         <w:ind w:left="210" w:hanging="210"/>
         <w:jc w:val="left"/>
         <w:rPr>
           <w:rFonts w:ascii="Times New Roman" w:hAnsi="Times New Roman" w:cs="Times New Roman"/>
           <w:szCs w:val="21"/>
         </w:rPr>
+        <w:snapToGrid w:val="0"/>
+      </w:pPr>
+      <w:r>
+        <w:rPr>
+          <w:rFonts w:ascii="Times New Roman" w:hAnsi="Times New Roman" w:cs="Times New Roman"/>
+          <w:szCs w:val="21"/>
+        </w:rPr>
+        <w:t>•</w:t>
+        <w:tab/>
+        <w:t>Conducted questionnaires and interviews on adapting online tutorials to users’ materials, tools, and environments.</w:t>
+      </w:r>
+      <w:r>
+        <w:rPr>
+          <w:rFonts w:ascii="Times New Roman" w:hAnsi="Times New Roman" w:cs="Times New Roman"/>
+          <w:szCs w:val="21"/>
+        </w:rPr>
+      </w:r>
+    </w:p>
+    <w:p>
+      <w:pPr>
+        <w:tabs>
+          <w:tab w:val="left" w:pos="210"/>
+        </w:tabs>
+        <w:spacing w:line="230" w:lineRule="exact" w:after="40" w:before="0"/>
+        <w:ind w:left="210" w:hanging="210"/>
+        <w:jc w:val="left"/>
+        <w:rPr>
+          <w:rFonts w:ascii="Times New Roman" w:hAnsi="Times New Roman" w:cs="Times New Roman"/>
+          <w:szCs w:val="21"/>
+        </w:rPr>
+        <w:snapToGrid w:val="0"/>
+      </w:pPr>
+      <w:r>
+        <w:rPr>
+          <w:rFonts w:ascii="Times New Roman" w:hAnsi="Times New Roman" w:cs="Times New Roman"/>
+          <w:szCs w:val="21"/>
+        </w:rPr>
+        <w:t>•</w:t>
+        <w:tab/>
+        <w:t>Synthesized findings into design goals; created paper figures and supported user-study design and execution.</w:t>
+      </w:r>
+      <w:r>
+        <w:rPr>
+          <w:rFonts w:ascii="Times New Roman" w:hAnsi="Times New Roman" w:cs="Times New Roman"/>
+          <w:szCs w:val="21"/>
+        </w:rPr>
+      </w:r>
+    </w:p>
+    <w:p>
+      <w:pPr>
+        <w:keepNext/>
+        <w:spacing w:line="230" w:lineRule="exact" w:after="40" w:before="0"/>
+        <w:jc w:val="left"/>
+        <w:rPr>
+          <w:rFonts w:ascii="Times New Roman" w:hAnsi="Times New Roman" w:cs="Times New Roman"/>
+          <w:szCs w:val="21"/>
+        </w:rPr>
+        <w:snapToGrid w:val="0"/>
+      </w:pPr>
+      <w:r>
+        <w:rPr>
+          <w:rFonts w:ascii="Times New Roman" w:hAnsi="Times New Roman" w:cs="Times New Roman"/>
+          <w:b/>
+          <w:szCs w:val="21"/>
+        </w:rPr>
+        <w:t>Situation-Bound Intent</w:t>
+      </w:r>
+    </w:p>
+    <w:p>
+      <w:pPr>
+        <w:keepNext/>
+        <w:spacing w:line="230" w:lineRule="exact" w:after="40" w:before="0"/>
+        <w:jc w:val="left"/>
+        <w:rPr>
+          <w:rFonts w:ascii="Times New Roman" w:hAnsi="Times New Roman" w:cs="Times New Roman"/>
+          <w:i/>
+          <w:szCs w:val="21"/>
+        </w:rPr>
+        <w:snapToGrid w:val="0"/>
+      </w:pPr>
+      <w:r>
+        <w:rPr>
+          <w:rFonts w:ascii="Times New Roman" w:hAnsi="Times New Roman" w:cs="Times New Roman"/>
+          <w:i/>
+          <w:szCs w:val="21"/>
+        </w:rPr>
+        <w:t>Manuscript submitted to ACM TOCHI; fourth author.</w:t>
+      </w:r>
+    </w:p>
+    <w:p>
+      <w:pPr>
+        <w:tabs>
+          <w:tab w:val="left" w:pos="210"/>
+        </w:tabs>
+        <w:spacing w:line="230" w:lineRule="exact" w:after="40" w:before="0"/>
+        <w:ind w:left="210" w:hanging="210"/>
+        <w:jc w:val="left"/>
+        <w:rPr>
+          <w:rFonts w:ascii="Times New Roman" w:hAnsi="Times New Roman" w:cs="Times New Roman"/>
+          <w:szCs w:val="21"/>
+        </w:rPr>
+        <w:snapToGrid w:val="0"/>
+      </w:pPr>
+      <w:r>
+        <w:rPr>
+          <w:rFonts w:ascii="Times New Roman" w:hAnsi="Times New Roman" w:cs="Times New Roman"/>
+          <w:szCs w:val="21"/>
+        </w:rPr>
+        <w:t>•</w:t>
+        <w:tab/>
+        <w:t>Designed modular wearable hardware for situation-aware prospective memory assistance.</w:t>
+      </w:r>
+      <w:r>
+        <w:rPr>
+          <w:rFonts w:ascii="Times New Roman" w:hAnsi="Times New Roman" w:cs="Times New Roman"/>
+          <w:szCs w:val="21"/>
+        </w:rPr>
+      </w:r>
+    </w:p>
+    <w:p>
+      <w:pPr>
+        <w:tabs>
+          <w:tab w:val="left" w:pos="210"/>
+        </w:tabs>
+        <w:spacing w:line="230" w:lineRule="exact" w:after="40" w:before="0"/>
+        <w:ind w:left="210" w:hanging="210"/>
+        <w:jc w:val="left"/>
+        <w:rPr>
+          <w:rFonts w:ascii="Times New Roman" w:hAnsi="Times New Roman" w:cs="Times New Roman"/>
+          <w:szCs w:val="21"/>
+        </w:rPr>
+        <w:snapToGrid w:val="0"/>
+      </w:pPr>
+      <w:r>
+        <w:rPr>
+          <w:rFonts w:ascii="Times New Roman" w:hAnsi="Times New Roman" w:cs="Times New Roman"/>
+          <w:szCs w:val="21"/>
+        </w:rPr>
+        <w:t>•</w:t>
+      </w:r>
+      <w:r>
+        <w:rPr>
+          <w:rFonts w:ascii="Times New Roman" w:hAnsi="Times New Roman" w:cs="Times New Roman"/>
+          <w:szCs w:val="21"/>
+        </w:rPr>
+        <w:tab/>
+        <w:t>Created user-study result figures and refined other manuscript visuals.</w:t>
+      </w:r>
+    </w:p>
+    <w:p>
+      <w:pPr>
+        <w:keepNext/>
+        <w:tabs>
+          <w:tab w:val="right" w:pos="9026"/>
+        </w:tabs>
+        <w:spacing w:line="230" w:lineRule="exact" w:after="40" w:before="0"/>
+        <w:jc w:val="left"/>
+        <w:rPr>
+          <w:rFonts w:ascii="Times New Roman" w:hAnsi="Times New Roman" w:cs="Times New Roman"/>
+          <w:b/>
+          <w:szCs w:val="21"/>
+        </w:rPr>
+        <w:snapToGrid w:val="0"/>
+      </w:pPr>
+      <w:r>
+        <w:rPr>
+          <w:rFonts w:ascii="Times New Roman" w:hAnsi="Times New Roman" w:cs="Times New Roman"/>
+          <w:b/>
+          <w:szCs w:val="21"/>
+        </w:rPr>
+        <w:t>School of Mechanical Engineering &amp; Automation, BUAA</w:t>
+      </w:r>
+      <w:r>
+        <w:rPr>
+          <w:rFonts w:ascii="Times New Roman" w:hAnsi="Times New Roman" w:cs="Times New Roman"/>
+          <w:szCs w:val="21"/>
+        </w:rPr>
+        <w:tab/>
+        <w:t>09/2025-03/2026</w:t>
+      </w:r>
+    </w:p>
+    <w:p>
+      <w:pPr>
+        <w:keepNext/>
+        <w:spacing w:line="230" w:lineRule="exact" w:after="40" w:before="0"/>
+        <w:jc w:val="left"/>
+        <w:rPr>
+          <w:rFonts w:ascii="Times New Roman" w:hAnsi="Times New Roman" w:cs="Times New Roman"/>
+          <w:i/>
+          <w:szCs w:val="21"/>
+        </w:rPr>
+        <w:snapToGrid w:val="0"/>
+      </w:pPr>
+      <w:r>
+        <w:rPr>
+          <w:rFonts w:ascii="Times New Roman" w:hAnsi="Times New Roman" w:cs="Times New Roman"/>
+          <w:i/>
+          <w:szCs w:val="21"/>
+        </w:rPr>
+        <w:t>Part-time Research Assistant, High-temperature and High-pressure Flexible Forming Laboratory</w:t>
+      </w:r>
+    </w:p>
+    <w:p>
+      <w:pPr>
+        <w:tabs>
+          <w:tab w:val="left" w:pos="210"/>
+        </w:tabs>
+        <w:spacing w:line="230" w:lineRule="exact" w:after="40" w:before="0"/>
+        <w:ind w:left="210" w:hanging="210"/>
+        <w:jc w:val="left"/>
+        <w:rPr>
+          <w:rFonts w:ascii="Times New Roman" w:hAnsi="Times New Roman" w:cs="Times New Roman"/>
+          <w:szCs w:val="21"/>
+        </w:rPr>
+        <w:snapToGrid w:val="0"/>
       </w:pPr>
       <w:r>
         <w:rPr>
@@ -752,7 +931,7 @@
         <w:pBdr>
           <w:bottom w:val="single" w:sz="6" w:space="1" w:color="auto"/>
         </w:pBdr>
-        <w:spacing w:beforeLines="40" w:before="124" w:line="256" w:lineRule="exact"/>
+        <w:spacing w:beforeLines="40" w:before="120" w:line="230" w:lineRule="exact" w:after="60"/>
         <w:jc w:val="left"/>
         <w:rPr>
           <w:rFonts w:ascii="Times New Roman" w:hAnsi="Times New Roman" w:cs="Times New Roman"/>
@@ -760,12 +939,13 @@
           <w:sz w:val="23"/>
           <w:szCs w:val="23"/>
         </w:rPr>
+        <w:snapToGrid w:val="0"/>
       </w:pPr>
       <w:r>
         <w:rPr>
           <w:rFonts w:ascii="Times New Roman" w:hAnsi="Times New Roman" w:cs="Times New Roman"/>
           <w:b/>
-          <w:sz w:val="23"/>
+          <w:sz w:val="20"/>
           <w:szCs w:val="23"/>
         </w:rPr>
         <w:t>Publication</w:t>
@@ -776,12 +956,13 @@
         <w:tabs>
           <w:tab w:val="left" w:pos="210"/>
         </w:tabs>
-        <w:spacing w:line="256" w:lineRule="exact"/>
-        <w:jc w:val="left"/>
-        <w:rPr>
-          <w:rFonts w:ascii="Times New Roman" w:hAnsi="Times New Roman" w:cs="Times New Roman"/>
-          <w:szCs w:val="21"/>
-        </w:rPr>
+        <w:spacing w:line="230" w:lineRule="exact" w:after="40" w:before="0"/>
+        <w:jc w:val="left"/>
+        <w:rPr>
+          <w:rFonts w:ascii="Times New Roman" w:hAnsi="Times New Roman" w:cs="Times New Roman"/>
+          <w:szCs w:val="21"/>
+        </w:rPr>
+        <w:snapToGrid w:val="0"/>
       </w:pPr>
       <w:r>
         <w:rPr>
@@ -789,51 +970,6 @@
           <w:szCs w:val="21"/>
         </w:rPr>
         <w:t>Gao, Z., &amp; Xu, W. (2026). Product innovation design based on the sail-shaped structural characteristics of Velella. Journal of Northwest Normal University (Natural Science), 62(4), 92–100. In Chinese. DOI: 10.16783/j.cnki.nwnuz.2026.04.009.</w:t>
-      </w:r>
-    </w:p>
-    <w:p>
-      <w:pPr>
-        <w:keepNext/>
-        <w:keepLines/>
-        <w:pBdr>
-          <w:bottom w:val="single" w:sz="6" w:space="1" w:color="000000"/>
-        </w:pBdr>
-        <w:spacing w:before="80" w:after="28" w:line="280" w:lineRule="exact"/>
-        <w:jc w:val="left"/>
-        <w:rPr>
-          <w:rFonts w:ascii="Times New Roman" w:hAnsi="Times New Roman" w:cs="Times New Roman"/>
-          <w:b/>
-          <w:sz w:val="23"/>
-          <w:szCs w:val="23"/>
-        </w:rPr>
-      </w:pPr>
-      <w:r>
-        <w:rPr>
-          <w:rFonts w:ascii="Times New Roman" w:hAnsi="Times New Roman" w:cs="Times New Roman"/>
-          <w:b/>
-          <w:sz w:val="23"/>
-          <w:szCs w:val="23"/>
-        </w:rPr>
-        <w:t>Research Presentation</w:t>
-      </w:r>
-    </w:p>
-    <w:p>
-      <w:pPr>
-        <w:keepLines/>
-        <w:spacing w:after="20" w:line="260" w:lineRule="exact"/>
-        <w:jc w:val="left"/>
-        <w:rPr>
-          <w:rFonts w:ascii="Times New Roman" w:hAnsi="Times New Roman" w:cs="Times New Roman"/>
-          <w:b/>
-          <w:szCs w:val="21"/>
-        </w:rPr>
-      </w:pPr>
-      <w:r>
-        <w:rPr>
-          <w:rFonts w:ascii="Times New Roman" w:hAnsi="Times New Roman" w:cs="Times New Roman"/>
-          <w:szCs w:val="21"/>
-        </w:rPr>
-        <w:t>Contextual AI Assistance in Physical Activities. Presented on behalf of the research group at the IDEA Lab Summer Meeting, Zhejiang University, 31 July 2026.</w:t>
       </w:r>
     </w:p>
     <w:p>
@@ -842,7 +978,7 @@
         <w:pBdr>
           <w:bottom w:val="single" w:sz="6" w:space="1" w:color="auto"/>
         </w:pBdr>
-        <w:spacing w:beforeLines="40" w:before="124" w:line="256" w:lineRule="exact"/>
+        <w:spacing w:beforeLines="40" w:before="120" w:line="230" w:lineRule="exact" w:after="60"/>
         <w:jc w:val="left"/>
         <w:rPr>
           <w:rFonts w:ascii="Times New Roman" w:hAnsi="Times New Roman" w:cs="Times New Roman"/>
@@ -850,12 +986,13 @@
           <w:sz w:val="23"/>
           <w:szCs w:val="23"/>
         </w:rPr>
+        <w:snapToGrid w:val="0"/>
       </w:pPr>
       <w:r>
         <w:rPr>
           <w:rFonts w:ascii="Times New Roman" w:hAnsi="Times New Roman" w:cs="Times New Roman"/>
           <w:b/>
-          <w:sz w:val="23"/>
+          <w:sz w:val="20"/>
           <w:szCs w:val="23"/>
         </w:rPr>
         <w:t>Selected Projects and Awards</w:t>
@@ -864,12 +1001,13 @@
     <w:p>
       <w:pPr>
         <w:keepNext/>
-        <w:spacing w:line="256" w:lineRule="exact"/>
-        <w:jc w:val="left"/>
-        <w:rPr>
-          <w:rFonts w:ascii="Times New Roman" w:hAnsi="Times New Roman" w:cs="Times New Roman"/>
-          <w:szCs w:val="21"/>
-        </w:rPr>
+        <w:spacing w:line="230" w:lineRule="exact" w:after="40" w:before="0"/>
+        <w:jc w:val="left"/>
+        <w:rPr>
+          <w:rFonts w:ascii="Times New Roman" w:hAnsi="Times New Roman" w:cs="Times New Roman"/>
+          <w:szCs w:val="21"/>
+        </w:rPr>
+        <w:snapToGrid w:val="0"/>
       </w:pPr>
       <w:r>
         <w:rPr>
@@ -885,13 +1023,14 @@
         <w:tabs>
           <w:tab w:val="left" w:pos="210"/>
         </w:tabs>
-        <w:spacing w:line="256" w:lineRule="exact"/>
+        <w:spacing w:line="230" w:lineRule="exact" w:after="40" w:before="0"/>
         <w:ind w:left="210" w:hanging="210"/>
         <w:jc w:val="left"/>
         <w:rPr>
           <w:rFonts w:ascii="Times New Roman" w:hAnsi="Times New Roman" w:cs="Times New Roman"/>
           <w:szCs w:val="21"/>
         </w:rPr>
+        <w:snapToGrid w:val="0"/>
       </w:pPr>
       <w:r>
         <w:rPr>
@@ -899,14 +1038,14 @@
           <w:szCs w:val="21"/>
         </w:rPr>
         <w:t>•</w:t>
-      </w:r>
-      <w:r>
-        <w:rPr>
-          <w:rFonts w:ascii="Times New Roman" w:hAnsi="Times New Roman" w:cs="Times New Roman"/>
-          <w:szCs w:val="21"/>
-        </w:rPr>
         <w:tab/>
-        <w:t>Developed a biomimetic modular floating transport platform through morphology research, physical experiments, simulation, and prototyping; published a first-authored journal article.</w:t>
+        <w:t>Developed a biomimetic floating platform through morphology research, experiments, simulation, and prototyping.</w:t>
+      </w:r>
+      <w:r>
+        <w:rPr>
+          <w:rFonts w:ascii="Times New Roman" w:hAnsi="Times New Roman" w:cs="Times New Roman"/>
+          <w:szCs w:val="21"/>
+        </w:rPr>
       </w:r>
     </w:p>
     <w:p>
@@ -914,13 +1053,14 @@
         <w:tabs>
           <w:tab w:val="left" w:pos="210"/>
         </w:tabs>
-        <w:spacing w:line="256" w:lineRule="exact"/>
+        <w:spacing w:line="230" w:lineRule="exact" w:after="40" w:before="0"/>
         <w:ind w:left="210" w:hanging="210"/>
         <w:jc w:val="left"/>
         <w:rPr>
           <w:rFonts w:ascii="Times New Roman" w:hAnsi="Times New Roman" w:cs="Times New Roman"/>
           <w:szCs w:val="21"/>
         </w:rPr>
+        <w:snapToGrid w:val="0"/>
       </w:pPr>
       <w:r>
         <w:rPr>
@@ -958,7 +1098,7 @@
         <w:pBdr>
           <w:bottom w:val="single" w:sz="6" w:space="1" w:color="auto"/>
         </w:pBdr>
-        <w:spacing w:beforeLines="40" w:before="124" w:line="256" w:lineRule="exact"/>
+        <w:spacing w:beforeLines="40" w:before="120" w:line="230" w:lineRule="exact" w:after="60"/>
         <w:jc w:val="left"/>
         <w:rPr>
           <w:rFonts w:ascii="Times New Roman" w:hAnsi="Times New Roman" w:cs="Times New Roman"/>
@@ -966,12 +1106,13 @@
           <w:sz w:val="23"/>
           <w:szCs w:val="23"/>
         </w:rPr>
+        <w:snapToGrid w:val="0"/>
       </w:pPr>
       <w:r>
         <w:rPr>
           <w:rFonts w:ascii="Times New Roman" w:hAnsi="Times New Roman" w:cs="Times New Roman"/>
           <w:b/>
-          <w:sz w:val="23"/>
+          <w:sz w:val="20"/>
           <w:szCs w:val="23"/>
         </w:rPr>
         <w:t>Skills and Teaching Experience</w:t>
@@ -982,13 +1123,14 @@
         <w:tabs>
           <w:tab w:val="left" w:pos="210"/>
         </w:tabs>
-        <w:spacing w:line="256" w:lineRule="exact"/>
+        <w:spacing w:line="230" w:lineRule="exact" w:after="40" w:before="0"/>
         <w:ind w:left="210" w:hanging="210"/>
         <w:jc w:val="left"/>
         <w:rPr>
           <w:rFonts w:ascii="Times New Roman" w:hAnsi="Times New Roman" w:cs="Times New Roman"/>
           <w:szCs w:val="21"/>
         </w:rPr>
+        <w:snapToGrid w:val="0"/>
       </w:pPr>
       <w:r>
         <w:rPr>
@@ -1011,13 +1153,14 @@
         <w:tabs>
           <w:tab w:val="left" w:pos="210"/>
         </w:tabs>
-        <w:spacing w:line="256" w:lineRule="exact"/>
+        <w:spacing w:line="230" w:lineRule="exact" w:after="40" w:before="0"/>
         <w:ind w:left="210" w:hanging="210"/>
         <w:jc w:val="left"/>
         <w:rPr>
           <w:rFonts w:ascii="Times New Roman" w:hAnsi="Times New Roman" w:cs="Times New Roman"/>
           <w:szCs w:val="21"/>
         </w:rPr>
+        <w:snapToGrid w:val="0"/>
       </w:pPr>
       <w:r>
         <w:rPr>
@@ -1070,13 +1213,14 @@
         <w:tabs>
           <w:tab w:val="left" w:pos="210"/>
         </w:tabs>
-        <w:spacing w:line="256" w:lineRule="exact"/>
+        <w:spacing w:line="230" w:lineRule="exact" w:after="40" w:before="0"/>
         <w:ind w:left="210" w:hanging="210"/>
         <w:jc w:val="left"/>
         <w:rPr>
-          <w:rFonts w:ascii="Times New Roman" w:hAnsi="Times New Roman" w:cs="Times New Roman" w:hint="eastAsia"/>
-          <w:szCs w:val="21"/>
-        </w:rPr>
+          <w:rFonts w:ascii="Times New Roman" w:hAnsi="Times New Roman" w:cs="Times New Roman"/>
+          <w:szCs w:val="21"/>
+        </w:rPr>
+        <w:snapToGrid w:val="0"/>
       </w:pPr>
       <w:r>
         <w:rPr>
@@ -1091,97 +1235,7 @@
           <w:szCs w:val="21"/>
         </w:rPr>
         <w:tab/>
-      </w:r>
-      <w:r>
-        <w:rPr>
-          <w:rFonts w:ascii="Times New Roman" w:hAnsi="Times New Roman" w:cs="Times New Roman"/>
-          <w:szCs w:val="21"/>
-        </w:rPr>
-        <w:t xml:space="preserve">Language: </w:t>
-      </w:r>
-      <w:r>
-        <w:rPr>
-          <w:rFonts w:ascii="Times New Roman" w:hAnsi="Times New Roman" w:cs="Times New Roman"/>
-          <w:szCs w:val="21"/>
-        </w:rPr>
-        <w:t>Mandarin Chinese</w:t>
-      </w:r>
-      <w:r>
-        <w:rPr>
-          <w:rFonts w:ascii="Times New Roman" w:hAnsi="Times New Roman" w:cs="Times New Roman" w:hint="eastAsia"/>
-          <w:szCs w:val="21"/>
-        </w:rPr>
-        <w:t xml:space="preserve"> (</w:t>
-      </w:r>
-      <w:r>
-        <w:rPr>
-          <w:rFonts w:ascii="Times New Roman" w:hAnsi="Times New Roman" w:cs="Times New Roman"/>
-          <w:szCs w:val="21"/>
-        </w:rPr>
-        <w:t>Native</w:t>
-      </w:r>
-      <w:r>
-        <w:rPr>
-          <w:rFonts w:ascii="Times New Roman" w:hAnsi="Times New Roman" w:cs="Times New Roman" w:hint="eastAsia"/>
-          <w:szCs w:val="21"/>
-        </w:rPr>
-        <w:t>)</w:t>
-      </w:r>
-      <w:r>
-        <w:rPr>
-          <w:rFonts w:ascii="Times New Roman" w:hAnsi="Times New Roman" w:cs="Times New Roman"/>
-          <w:szCs w:val="21"/>
-        </w:rPr>
-        <w:t xml:space="preserve">; English </w:t>
-      </w:r>
-      <w:r>
-        <w:rPr>
-          <w:rFonts w:ascii="Times New Roman" w:hAnsi="Times New Roman" w:cs="Times New Roman" w:hint="eastAsia"/>
-          <w:szCs w:val="21"/>
-        </w:rPr>
-        <w:t>(</w:t>
-      </w:r>
-      <w:r>
-        <w:rPr>
-          <w:rFonts w:ascii="Times New Roman" w:hAnsi="Times New Roman" w:cs="Times New Roman"/>
-          <w:szCs w:val="21"/>
-        </w:rPr>
-        <w:t>IELTS 6.5</w:t>
-      </w:r>
-      <w:r>
-        <w:rPr>
-          <w:rFonts w:ascii="Times New Roman" w:hAnsi="Times New Roman" w:cs="Times New Roman" w:hint="eastAsia"/>
-          <w:szCs w:val="21"/>
-        </w:rPr>
-        <w:t>)</w:t>
-      </w:r>
-      <w:r>
-        <w:rPr>
-          <w:rFonts w:ascii="Times New Roman" w:hAnsi="Times New Roman" w:cs="Times New Roman"/>
-          <w:szCs w:val="21"/>
-        </w:rPr>
-        <w:t xml:space="preserve">; Japanese </w:t>
-      </w:r>
-      <w:r>
-        <w:rPr>
-          <w:rFonts w:ascii="Times New Roman" w:hAnsi="Times New Roman" w:cs="Times New Roman" w:hint="eastAsia"/>
-          <w:szCs w:val="21"/>
-        </w:rPr>
-        <w:t>(</w:t>
-      </w:r>
-      <w:r>
-        <w:rPr>
-          <w:rFonts w:ascii="Times New Roman" w:hAnsi="Times New Roman" w:cs="Times New Roman"/>
-          <w:szCs w:val="21"/>
-        </w:rPr>
-        <w:t>JLPT N2</w:t>
-      </w:r>
-      <w:r>
-        <w:rPr>
-          <w:rFonts w:ascii="Times New Roman" w:hAnsi="Times New Roman" w:cs="Times New Roman" w:hint="eastAsia"/>
-          <w:szCs w:val="21"/>
-        </w:rPr>
-        <w:t>)</w:t>
+        <w:t>Languages: Mandarin Chinese (native); English (IELTS 6.5); Japanese (JLPT N2).</w:t>
       </w:r>
     </w:p>
     <w:p>
@@ -1189,13 +1243,14 @@
         <w:tabs>
           <w:tab w:val="left" w:pos="210"/>
         </w:tabs>
-        <w:spacing w:line="256" w:lineRule="exact"/>
+        <w:spacing w:line="230" w:lineRule="exact" w:after="40" w:before="0"/>
         <w:ind w:left="210" w:hanging="210"/>
         <w:jc w:val="left"/>
         <w:rPr>
           <w:rFonts w:ascii="Times New Roman" w:hAnsi="Times New Roman" w:cs="Times New Roman"/>
           <w:szCs w:val="21"/>
         </w:rPr>
+        <w:snapToGrid w:val="0"/>
       </w:pPr>
       <w:r>
         <w:rPr>
@@ -1217,7 +1272,6 @@
       <w:pgSz w:w="11906" w:h="16838"/>
       <w:pgMar w:top="851" w:right="1440" w:bottom="851" w:left="1440" w:header="851" w:footer="992" w:gutter="0"/>
       <w:cols w:space="425"/>
-      <w:docGrid w:type="lines" w:linePitch="312"/>
     </w:sectPr>
   </w:body>
 </w:document>

</xml_diff>